<commit_message>
Edited generate.py for a bit more image support. Added _headers for cache
</commit_message>
<xml_diff>
--- a/content/geography/Vrey/index.docx
+++ b/content/geography/Vrey/index.docx
@@ -7,7 +7,38 @@
         <w:t>This is a placeholder country</w:t>
       </w:r>
       <w:r>
-        <w:t>. It has Bitburg inside,</w:t>
+        <w:t>. It has Bitburg inside</w:t>
+      </w:r>
+      <w:r>
+        <w:t xml:space="preserve"> and many other places.</w:t>
+      </w:r>
+    </w:p>
+    <w:p/>
+    <w:p>
+      <w:r>
+        <w:t>=== Cities</w:t>
+      </w:r>
+    </w:p>
+    <w:p>
+      <w:r>
+        <w:t>Bitburg</w:t>
+      </w:r>
+    </w:p>
+    <w:p>
+      <w:r>
+        <w:t>Esthel</w:t>
+      </w:r>
+    </w:p>
+    <w:p/>
+    <w:p/>
+    <w:p>
+      <w:r>
+        <w:t>=== Locations</w:t>
+      </w:r>
+    </w:p>
+    <w:p>
+      <w:r>
+        <w:t>Maledictus Forest</w:t>
       </w:r>
     </w:p>
     <w:sectPr>

</xml_diff>